<commit_message>
docs(srs): update Peshawari_Chappal_FYP_SRS.docx with calibrated, zero-overlap black-and-white diagrams
</commit_message>
<xml_diff>
--- a/Peshawari_Chappal_FYP_SRS.docx
+++ b/Peshawari_Chappal_FYP_SRS.docx
@@ -5640,7 +5640,7 @@
       <w:r>
         <w:drawing>
           <wp:inline xmlns:a="http://schemas.openxmlformats.org/drawingml/2006/main" xmlns:pic="http://schemas.openxmlformats.org/drawingml/2006/picture">
-            <wp:extent cx="5669280" cy="3543300"/>
+            <wp:extent cx="5669280" cy="3644537"/>
             <wp:docPr id="1" name="Picture 1"/>
             <wp:cNvGraphicFramePr>
               <a:graphicFrameLocks noChangeAspect="1"/>
@@ -5661,7 +5661,7 @@
                   <pic:spPr>
                     <a:xfrm>
                       <a:off x="0" y="0"/>
-                      <a:ext cx="5669280" cy="3543300"/>
+                      <a:ext cx="5669280" cy="3644537"/>
                     </a:xfrm>
                     <a:prstGeom prst="rect"/>
                   </pic:spPr>
@@ -5682,7 +5682,7 @@
           <w:rFonts w:ascii="Times New Roman" w:hAnsi="Times New Roman"/>
           <w:b/>
           <w:i/>
-          <w:color w:val="3C3C3C"/>
+          <w:color w:val="000000"/>
           <w:sz w:val="21"/>
         </w:rPr>
         <w:t>Figure B-1: High-Level Multi-Tier System Architecture Diagram</w:t>
@@ -5724,7 +5724,7 @@
       <w:r>
         <w:drawing>
           <wp:inline xmlns:a="http://schemas.openxmlformats.org/drawingml/2006/main" xmlns:pic="http://schemas.openxmlformats.org/drawingml/2006/picture">
-            <wp:extent cx="5669280" cy="3607724"/>
+            <wp:extent cx="5669280" cy="3488788"/>
             <wp:docPr id="2" name="Picture 2"/>
             <wp:cNvGraphicFramePr>
               <a:graphicFrameLocks noChangeAspect="1"/>
@@ -5745,7 +5745,7 @@
                   <pic:spPr>
                     <a:xfrm>
                       <a:off x="0" y="0"/>
-                      <a:ext cx="5669280" cy="3607724"/>
+                      <a:ext cx="5669280" cy="3488788"/>
                     </a:xfrm>
                     <a:prstGeom prst="rect"/>
                   </pic:spPr>
@@ -5766,7 +5766,7 @@
           <w:rFonts w:ascii="Times New Roman" w:hAnsi="Times New Roman"/>
           <w:b/>
           <w:i/>
-          <w:color w:val="3C3C3C"/>
+          <w:color w:val="000000"/>
           <w:sz w:val="21"/>
         </w:rPr>
         <w:t>Figure B-2: Data Flow Diagram (DFD) Level 0 — Context Diagram</w:t>
@@ -5813,7 +5813,7 @@
       <w:r>
         <w:drawing>
           <wp:inline xmlns:a="http://schemas.openxmlformats.org/drawingml/2006/main" xmlns:pic="http://schemas.openxmlformats.org/drawingml/2006/picture">
-            <wp:extent cx="5669280" cy="3488788"/>
+            <wp:extent cx="5669280" cy="3442063"/>
             <wp:docPr id="3" name="Picture 3"/>
             <wp:cNvGraphicFramePr>
               <a:graphicFrameLocks noChangeAspect="1"/>
@@ -5834,7 +5834,7 @@
                   <pic:spPr>
                     <a:xfrm>
                       <a:off x="0" y="0"/>
-                      <a:ext cx="5669280" cy="3488788"/>
+                      <a:ext cx="5669280" cy="3442063"/>
                     </a:xfrm>
                     <a:prstGeom prst="rect"/>
                   </pic:spPr>
@@ -5855,7 +5855,7 @@
           <w:rFonts w:ascii="Times New Roman" w:hAnsi="Times New Roman"/>
           <w:b/>
           <w:i/>
-          <w:color w:val="3C3C3C"/>
+          <w:color w:val="000000"/>
           <w:sz w:val="21"/>
         </w:rPr>
         <w:t>Figure B-3: Data Flow Diagram (DFD) Level 1 — Core Process Decomposition</w:t>
@@ -5897,7 +5897,7 @@
       <w:r>
         <w:drawing>
           <wp:inline xmlns:a="http://schemas.openxmlformats.org/drawingml/2006/main" xmlns:pic="http://schemas.openxmlformats.org/drawingml/2006/picture">
-            <wp:extent cx="5669280" cy="3543300"/>
+            <wp:extent cx="5669280" cy="3488788"/>
             <wp:docPr id="4" name="Picture 4"/>
             <wp:cNvGraphicFramePr>
               <a:graphicFrameLocks noChangeAspect="1"/>
@@ -5918,7 +5918,7 @@
                   <pic:spPr>
                     <a:xfrm>
                       <a:off x="0" y="0"/>
-                      <a:ext cx="5669280" cy="3543300"/>
+                      <a:ext cx="5669280" cy="3488788"/>
                     </a:xfrm>
                     <a:prstGeom prst="rect"/>
                   </pic:spPr>
@@ -5939,7 +5939,7 @@
           <w:rFonts w:ascii="Times New Roman" w:hAnsi="Times New Roman"/>
           <w:b/>
           <w:i/>
-          <w:color w:val="3C3C3C"/>
+          <w:color w:val="000000"/>
           <w:sz w:val="21"/>
         </w:rPr>
         <w:t>Figure B-4: Data Flow Diagram (DFD) Level 2 — AI Foot Sizing Subsystem</w:t>
@@ -5986,7 +5986,7 @@
       <w:r>
         <w:drawing>
           <wp:inline xmlns:a="http://schemas.openxmlformats.org/drawingml/2006/main" xmlns:pic="http://schemas.openxmlformats.org/drawingml/2006/picture">
-            <wp:extent cx="5669280" cy="4015740"/>
+            <wp:extent cx="5669280" cy="3644537"/>
             <wp:docPr id="5" name="Picture 5"/>
             <wp:cNvGraphicFramePr>
               <a:graphicFrameLocks noChangeAspect="1"/>
@@ -6007,7 +6007,7 @@
                   <pic:spPr>
                     <a:xfrm>
                       <a:off x="0" y="0"/>
-                      <a:ext cx="5669280" cy="4015740"/>
+                      <a:ext cx="5669280" cy="3644537"/>
                     </a:xfrm>
                     <a:prstGeom prst="rect"/>
                   </pic:spPr>
@@ -6028,7 +6028,7 @@
           <w:rFonts w:ascii="Times New Roman" w:hAnsi="Times New Roman"/>
           <w:b/>
           <w:i/>
-          <w:color w:val="3C3C3C"/>
+          <w:color w:val="000000"/>
           <w:sz w:val="21"/>
         </w:rPr>
         <w:t>Figure B-5: Complete UML Use Case Diagram</w:t>
@@ -6070,7 +6070,7 @@
       <w:r>
         <w:drawing>
           <wp:inline xmlns:a="http://schemas.openxmlformats.org/drawingml/2006/main" xmlns:pic="http://schemas.openxmlformats.org/drawingml/2006/picture">
-            <wp:extent cx="5669280" cy="3488788"/>
+            <wp:extent cx="5669280" cy="3644537"/>
             <wp:docPr id="6" name="Picture 6"/>
             <wp:cNvGraphicFramePr>
               <a:graphicFrameLocks noChangeAspect="1"/>
@@ -6091,7 +6091,7 @@
                   <pic:spPr>
                     <a:xfrm>
                       <a:off x="0" y="0"/>
-                      <a:ext cx="5669280" cy="3488788"/>
+                      <a:ext cx="5669280" cy="3644537"/>
                     </a:xfrm>
                     <a:prstGeom prst="rect"/>
                   </pic:spPr>
@@ -6112,7 +6112,7 @@
           <w:rFonts w:ascii="Times New Roman" w:hAnsi="Times New Roman"/>
           <w:b/>
           <w:i/>
-          <w:color w:val="3C3C3C"/>
+          <w:color w:val="000000"/>
           <w:sz w:val="21"/>
         </w:rPr>
         <w:t>Figure B-6: Entity-Relationship Diagram (ERD) with Field Constraints</w:t>
@@ -6159,7 +6159,7 @@
       <w:r>
         <w:drawing>
           <wp:inline xmlns:a="http://schemas.openxmlformats.org/drawingml/2006/main" xmlns:pic="http://schemas.openxmlformats.org/drawingml/2006/picture">
-            <wp:extent cx="5669280" cy="3543300"/>
+            <wp:extent cx="5669280" cy="3488788"/>
             <wp:docPr id="7" name="Picture 7"/>
             <wp:cNvGraphicFramePr>
               <a:graphicFrameLocks noChangeAspect="1"/>
@@ -6180,7 +6180,7 @@
                   <pic:spPr>
                     <a:xfrm>
                       <a:off x="0" y="0"/>
-                      <a:ext cx="5669280" cy="3543300"/>
+                      <a:ext cx="5669280" cy="3488788"/>
                     </a:xfrm>
                     <a:prstGeom prst="rect"/>
                   </pic:spPr>
@@ -6201,7 +6201,7 @@
           <w:rFonts w:ascii="Times New Roman" w:hAnsi="Times New Roman"/>
           <w:b/>
           <w:i/>
-          <w:color w:val="3C3C3C"/>
+          <w:color w:val="000000"/>
           <w:sz w:val="21"/>
         </w:rPr>
         <w:t>Figure B-7: UML Sequence Diagram — Multimodal AI Product Auto-Fill Cascade</w:t>
@@ -6243,7 +6243,7 @@
       <w:r>
         <w:drawing>
           <wp:inline xmlns:a="http://schemas.openxmlformats.org/drawingml/2006/main" xmlns:pic="http://schemas.openxmlformats.org/drawingml/2006/picture">
-            <wp:extent cx="5669280" cy="3543300"/>
+            <wp:extent cx="5669280" cy="3488788"/>
             <wp:docPr id="8" name="Picture 8"/>
             <wp:cNvGraphicFramePr>
               <a:graphicFrameLocks noChangeAspect="1"/>
@@ -6264,7 +6264,7 @@
                   <pic:spPr>
                     <a:xfrm>
                       <a:off x="0" y="0"/>
-                      <a:ext cx="5669280" cy="3543300"/>
+                      <a:ext cx="5669280" cy="3488788"/>
                     </a:xfrm>
                     <a:prstGeom prst="rect"/>
                   </pic:spPr>
@@ -6285,7 +6285,7 @@
           <w:rFonts w:ascii="Times New Roman" w:hAnsi="Times New Roman"/>
           <w:b/>
           <w:i/>
-          <w:color w:val="3C3C3C"/>
+          <w:color w:val="000000"/>
           <w:sz w:val="21"/>
         </w:rPr>
         <w:t>Figure B-8: UML Sequence Diagram — Customer Order Checkout &amp; Real-Time Tracking Flow</w:t>
@@ -6788,7 +6788,7 @@
       <w:rPr>
         <w:rFonts w:ascii="Times New Roman" w:hAnsi="Times New Roman"/>
         <w:i/>
-        <w:color w:val="787878"/>
+        <w:color w:val="000000"/>
         <w:sz w:val="18"/>
       </w:rPr>
       <w:t>Software Requirements Specification for Peshawari Chappal E-Commerce Platform</w:t>

</xml_diff>